<commit_message>
Use full contract template and signer fields
</commit_message>
<xml_diff>
--- a/data/Гэрээ.docx
+++ b/data/Гэрээ.docx
@@ -22,7 +22,7 @@
           <w:szCs w:val="24"/>
         </w:rPr>
         <w:drawing>
-          <wp:inline distT="0" distB="0" distL="0" distR="0" wp14:anchorId="1E5BC16E" wp14:editId="7E004CEB">
+          <wp:inline distT="0" distB="0" distL="0" distR="0" wp14:anchorId="1E5BC16E" wp14:editId="2B644F7F">
             <wp:extent cx="1254760" cy="329565"/>
             <wp:effectExtent l="0" t="0" r="2540" b="635"/>
             <wp:docPr id="1721680945" name="Picture 4" descr="A blue and black sign&#10;&#10;AI-generated content may be incorrect."/>
@@ -166,7 +166,7 @@
       <w:r>
         <w:rPr>
           <w:rFonts w:ascii="Times New Roman" w:hAnsi="Times New Roman" w:cs="Times New Roman"/>
-          <w:color w:val="000000" w:themeColor="text1"/>
+          <w:color w:val="EE0000"/>
           <w:sz w:val="24"/>
           <w:szCs w:val="24"/>
         </w:rPr>
@@ -175,7 +175,7 @@
       <w:r>
         <w:rPr>
           <w:rFonts w:ascii="Times New Roman" w:hAnsi="Times New Roman" w:cs="Times New Roman"/>
-          <w:color w:val="000000" w:themeColor="text1"/>
+          <w:color w:val="EE0000"/>
           <w:sz w:val="24"/>
           <w:szCs w:val="24"/>
         </w:rPr>
@@ -213,7 +213,7 @@
       <w:r>
         <w:rPr>
           <w:rFonts w:ascii="Times New Roman" w:hAnsi="Times New Roman" w:cs="Times New Roman"/>
-          <w:color w:val="000000" w:themeColor="text1"/>
+          <w:color w:val="EE0000"/>
           <w:sz w:val="24"/>
           <w:szCs w:val="24"/>
         </w:rPr>
@@ -251,7 +251,7 @@
       <w:r>
         <w:rPr>
           <w:rFonts w:ascii="Times New Roman" w:hAnsi="Times New Roman" w:cs="Times New Roman"/>
-          <w:color w:val="000000" w:themeColor="text1"/>
+          <w:color w:val="EE0000"/>
           <w:sz w:val="24"/>
           <w:szCs w:val="24"/>
         </w:rPr>
@@ -260,7 +260,7 @@
       <w:r>
         <w:rPr>
           <w:rFonts w:ascii="Times New Roman" w:hAnsi="Times New Roman" w:cs="Times New Roman"/>
-          <w:color w:val="000000" w:themeColor="text1"/>
+          <w:color w:val="EE0000"/>
           <w:sz w:val="24"/>
           <w:szCs w:val="24"/>
         </w:rPr>
@@ -728,7 +728,7 @@
       <w:r>
         <w:rPr>
           <w:rFonts w:ascii="Times New Roman" w:hAnsi="Times New Roman" w:cs="Times New Roman"/>
-          <w:color w:val="000000" w:themeColor="text1"/>
+          <w:color w:val="EE0000"/>
           <w:sz w:val="24"/>
           <w:szCs w:val="24"/>
           <w:lang w:val="mn-MN"/>
@@ -758,7 +758,7 @@
       <w:r>
         <w:rPr>
           <w:rFonts w:ascii="Times New Roman" w:hAnsi="Times New Roman" w:cs="Times New Roman"/>
-          <w:color w:val="000000" w:themeColor="text1"/>
+          <w:color w:val="EE0000"/>
           <w:sz w:val="24"/>
           <w:szCs w:val="24"/>
           <w:lang w:val="mn-MN"/>
@@ -788,7 +788,7 @@
       <w:r>
         <w:rPr>
           <w:rFonts w:ascii="Times New Roman" w:hAnsi="Times New Roman" w:cs="Times New Roman"/>
-          <w:color w:val="000000" w:themeColor="text1"/>
+          <w:color w:val="EE0000"/>
           <w:sz w:val="24"/>
           <w:szCs w:val="24"/>
           <w:lang w:val="mn-MN"/>
@@ -848,7 +848,7 @@
       <w:r>
         <w:rPr>
           <w:rFonts w:ascii="Times New Roman" w:hAnsi="Times New Roman" w:cs="Times New Roman"/>
-          <w:color w:val="000000" w:themeColor="text1"/>
+          <w:color w:val="EE0000"/>
           <w:sz w:val="24"/>
           <w:szCs w:val="24"/>
           <w:lang w:val="mn-MN"/>
@@ -878,7 +878,7 @@
       <w:r>
         <w:rPr>
           <w:rFonts w:ascii="Times New Roman" w:hAnsi="Times New Roman" w:cs="Times New Roman"/>
-          <w:color w:val="000000" w:themeColor="text1"/>
+          <w:color w:val="EE0000"/>
           <w:sz w:val="24"/>
           <w:szCs w:val="24"/>
           <w:lang w:val="mn-MN"/>
@@ -888,7 +888,7 @@
       <w:r>
         <w:rPr>
           <w:rFonts w:ascii="Times New Roman" w:hAnsi="Times New Roman" w:cs="Times New Roman"/>
-          <w:color w:val="000000" w:themeColor="text1"/>
+          <w:color w:val="EE0000"/>
           <w:sz w:val="24"/>
           <w:szCs w:val="24"/>
           <w:lang w:val="mn-MN"/>
@@ -908,7 +908,7 @@
       <w:r>
         <w:rPr>
           <w:rFonts w:ascii="Times New Roman" w:hAnsi="Times New Roman" w:cs="Times New Roman"/>
-          <w:color w:val="000000" w:themeColor="text1"/>
+          <w:color w:val="EE0000"/>
           <w:sz w:val="24"/>
           <w:szCs w:val="24"/>
         </w:rPr>
@@ -917,7 +917,7 @@
       <w:r>
         <w:rPr>
           <w:rFonts w:ascii="Times New Roman" w:hAnsi="Times New Roman" w:cs="Times New Roman"/>
-          <w:color w:val="000000" w:themeColor="text1"/>
+          <w:color w:val="EE0000"/>
           <w:sz w:val="24"/>
           <w:szCs w:val="24"/>
           <w:lang w:val="mn-MN"/>
@@ -928,7 +928,7 @@
       <w:r>
         <w:rPr>
           <w:rFonts w:ascii="Times New Roman" w:hAnsi="Times New Roman" w:cs="Times New Roman"/>
-          <w:color w:val="000000" w:themeColor="text1"/>
+          <w:color w:val="EE0000"/>
           <w:sz w:val="24"/>
           <w:szCs w:val="24"/>
           <w:lang w:val="mn-MN"/>
@@ -938,7 +938,7 @@
       <w:r>
         <w:rPr>
           <w:rFonts w:ascii="Times New Roman" w:hAnsi="Times New Roman" w:cs="Times New Roman"/>
-          <w:color w:val="000000" w:themeColor="text1"/>
+          <w:color w:val="EE0000"/>
           <w:sz w:val="24"/>
           <w:szCs w:val="24"/>
         </w:rPr>
@@ -1246,7 +1246,7 @@
           <w:rFonts w:ascii="Times New Roman" w:hAnsi="Times New Roman" w:cs="Times New Roman"/>
           <w:b/>
           <w:bCs/>
-          <w:color w:val="000000" w:themeColor="text1"/>
+          <w:color w:val="EE0000"/>
           <w:sz w:val="24"/>
           <w:szCs w:val="24"/>
         </w:rPr>
@@ -1257,7 +1257,7 @@
           <w:rFonts w:ascii="Times New Roman" w:hAnsi="Times New Roman" w:cs="Times New Roman"/>
           <w:b/>
           <w:bCs/>
-          <w:color w:val="000000" w:themeColor="text1"/>
+          <w:color w:val="EE0000"/>
           <w:sz w:val="24"/>
           <w:szCs w:val="24"/>
         </w:rPr>
@@ -1268,7 +1268,7 @@
           <w:rFonts w:ascii="Times New Roman" w:hAnsi="Times New Roman" w:cs="Times New Roman"/>
           <w:b/>
           <w:bCs/>
-          <w:color w:val="000000" w:themeColor="text1"/>
+          <w:color w:val="EE0000"/>
           <w:sz w:val="24"/>
           <w:szCs w:val="24"/>
         </w:rPr>
@@ -1279,7 +1279,7 @@
           <w:rFonts w:ascii="Times New Roman" w:hAnsi="Times New Roman" w:cs="Times New Roman"/>
           <w:b/>
           <w:bCs/>
-          <w:color w:val="000000" w:themeColor="text1"/>
+          <w:color w:val="EE0000"/>
           <w:sz w:val="24"/>
           <w:szCs w:val="24"/>
         </w:rPr>
@@ -1290,7 +1290,7 @@
           <w:rFonts w:ascii="Times New Roman" w:hAnsi="Times New Roman" w:cs="Times New Roman"/>
           <w:b/>
           <w:bCs/>
-          <w:color w:val="000000" w:themeColor="text1"/>
+          <w:color w:val="EE0000"/>
           <w:sz w:val="24"/>
           <w:szCs w:val="24"/>
         </w:rPr>
@@ -1301,7 +1301,7 @@
           <w:rFonts w:ascii="Times New Roman" w:hAnsi="Times New Roman" w:cs="Times New Roman"/>
           <w:b/>
           <w:bCs/>
-          <w:color w:val="000000" w:themeColor="text1"/>
+          <w:color w:val="EE0000"/>
           <w:sz w:val="24"/>
           <w:szCs w:val="24"/>
         </w:rPr>
@@ -1312,7 +1312,7 @@
           <w:rFonts w:ascii="Times New Roman" w:hAnsi="Times New Roman" w:cs="Times New Roman"/>
           <w:b/>
           <w:bCs/>
-          <w:color w:val="000000" w:themeColor="text1"/>
+          <w:color w:val="EE0000"/>
           <w:sz w:val="24"/>
           <w:szCs w:val="24"/>
         </w:rPr>
@@ -1323,7 +1323,7 @@
           <w:rFonts w:ascii="Times New Roman" w:hAnsi="Times New Roman" w:cs="Times New Roman"/>
           <w:b/>
           <w:bCs/>
-          <w:color w:val="000000" w:themeColor="text1"/>
+          <w:color w:val="EE0000"/>
           <w:sz w:val="24"/>
           <w:szCs w:val="24"/>
         </w:rPr>
@@ -1334,7 +1334,7 @@
           <w:rFonts w:ascii="Times New Roman" w:hAnsi="Times New Roman" w:cs="Times New Roman"/>
           <w:b/>
           <w:bCs/>
-          <w:color w:val="000000" w:themeColor="text1"/>
+          <w:color w:val="EE0000"/>
           <w:sz w:val="24"/>
           <w:szCs w:val="24"/>
         </w:rPr>
@@ -1345,7 +1345,7 @@
           <w:rFonts w:ascii="Times New Roman" w:hAnsi="Times New Roman" w:cs="Times New Roman"/>
           <w:b/>
           <w:bCs/>
-          <w:color w:val="000000" w:themeColor="text1"/>
+          <w:color w:val="EE0000"/>
           <w:sz w:val="24"/>
           <w:szCs w:val="24"/>
         </w:rPr>
@@ -1356,7 +1356,7 @@
           <w:rFonts w:ascii="Times New Roman" w:hAnsi="Times New Roman" w:cs="Times New Roman"/>
           <w:b/>
           <w:bCs/>
-          <w:color w:val="000000" w:themeColor="text1"/>
+          <w:color w:val="EE0000"/>
           <w:sz w:val="24"/>
           <w:szCs w:val="24"/>
         </w:rPr>
@@ -1367,12 +1367,12 @@
           <w:rFonts w:ascii="Times New Roman" w:hAnsi="Times New Roman" w:cs="Times New Roman"/>
           <w:b/>
           <w:bCs/>
-          <w:color w:val="000000" w:themeColor="text1"/>
+          <w:color w:val="EE0000"/>
           <w:sz w:val="24"/>
           <w:szCs w:val="24"/>
           <w:lang w:val="mn-MN"/>
         </w:rPr>
-        <w:t xml:space="preserve"> хооронд </w:t>
+        <w:t xml:space="preserve"> </w:t>
       </w:r>
       <w:r>
         <w:rPr>
@@ -1384,19 +1384,43 @@
           <w:szCs w:val="24"/>
           <w:lang w:val="mn-MN"/>
         </w:rPr>
-        <w:t xml:space="preserve">Египет </w:t>
+        <w:t xml:space="preserve">хооронд </w:t>
       </w:r>
       <w:r>
         <w:rPr>
           <w:rFonts w:ascii="Times New Roman" w:hAnsi="Times New Roman" w:cs="Times New Roman"/>
           <w:b/>
           <w:bCs/>
-          <w:color w:val="000000" w:themeColor="text1"/>
+          <w:color w:val="EE0000"/>
           <w:sz w:val="24"/>
           <w:szCs w:val="24"/>
           <w:lang w:val="mn-MN"/>
         </w:rPr>
-        <w:t xml:space="preserve">аяллын хөтөлбөртэй </w:t>
+        <w:t xml:space="preserve">Египет </w:t>
+      </w:r>
+      <w:r>
+        <w:rPr>
+          <w:rFonts w:ascii="Times New Roman" w:hAnsi="Times New Roman" w:cs="Times New Roman"/>
+          <w:b/>
+          <w:bCs/>
+          <w:color w:val="EE0000"/>
+          <w:sz w:val="24"/>
+          <w:szCs w:val="24"/>
+          <w:lang w:val="mn-MN"/>
+        </w:rPr>
+        <w:t>аяллын хөтөлбөртэй</w:t>
+      </w:r>
+      <w:r>
+        <w:rPr>
+          <w:rFonts w:ascii="Times New Roman" w:hAnsi="Times New Roman" w:cs="Times New Roman"/>
+          <w:b/>
+          <w:bCs/>
+          <w:color w:val="000000" w:themeColor="text1"/>
+          <w:sz w:val="24"/>
+          <w:szCs w:val="24"/>
+          <w:lang w:val="mn-MN"/>
+        </w:rPr>
+        <w:t xml:space="preserve"> </w:t>
       </w:r>
       <w:proofErr w:type="spellStart"/>
       <w:r>
@@ -5711,27 +5735,7 @@
           <w:sz w:val="24"/>
           <w:szCs w:val="24"/>
         </w:rPr>
-        <w:t xml:space="preserve"> </w:t>
-      </w:r>
-      <w:proofErr w:type="spellStart"/>
-      <w:r>
-        <w:rPr>
-          <w:rFonts w:ascii="Times New Roman" w:hAnsi="Times New Roman" w:cs="Times New Roman"/>
-          <w:color w:val="000000" w:themeColor="text1"/>
-          <w:sz w:val="24"/>
-          <w:szCs w:val="24"/>
-        </w:rPr>
-        <w:t>Жуулчин</w:t>
-      </w:r>
-      <w:proofErr w:type="spellEnd"/>
-      <w:r>
-        <w:rPr>
-          <w:rFonts w:ascii="Times New Roman" w:hAnsi="Times New Roman" w:cs="Times New Roman"/>
-          <w:color w:val="000000" w:themeColor="text1"/>
-          <w:sz w:val="24"/>
-          <w:szCs w:val="24"/>
-        </w:rPr>
-        <w:t xml:space="preserve">, </w:t>
+        <w:t xml:space="preserve"> Жуулчин, </w:t>
       </w:r>
       <w:proofErr w:type="spellStart"/>
       <w:r>
@@ -5771,27 +5775,7 @@
           <w:sz w:val="24"/>
           <w:szCs w:val="24"/>
         </w:rPr>
-        <w:t xml:space="preserve"> </w:t>
-      </w:r>
-      <w:proofErr w:type="spellStart"/>
-      <w:r>
-        <w:rPr>
-          <w:rFonts w:ascii="Times New Roman" w:hAnsi="Times New Roman" w:cs="Times New Roman"/>
-          <w:color w:val="000000" w:themeColor="text1"/>
-          <w:sz w:val="24"/>
-          <w:szCs w:val="24"/>
-        </w:rPr>
-        <w:t>Икс</w:t>
-      </w:r>
-      <w:proofErr w:type="spellEnd"/>
-      <w:r>
-        <w:rPr>
-          <w:rFonts w:ascii="Times New Roman" w:hAnsi="Times New Roman" w:cs="Times New Roman"/>
-          <w:color w:val="000000" w:themeColor="text1"/>
-          <w:sz w:val="24"/>
-          <w:szCs w:val="24"/>
-        </w:rPr>
-        <w:t xml:space="preserve">, </w:t>
+        <w:t xml:space="preserve"> Икс, </w:t>
       </w:r>
       <w:proofErr w:type="spellStart"/>
       <w:r>
@@ -10685,7 +10669,7 @@
           <w:rFonts w:ascii="Times New Roman" w:hAnsi="Times New Roman" w:cs="Times New Roman"/>
           <w:b/>
           <w:bCs/>
-          <w:color w:val="000000" w:themeColor="text1"/>
+          <w:color w:val="EE0000"/>
           <w:sz w:val="24"/>
           <w:szCs w:val="24"/>
         </w:rPr>
@@ -10696,7 +10680,7 @@
           <w:rFonts w:ascii="Times New Roman" w:hAnsi="Times New Roman" w:cs="Times New Roman"/>
           <w:b/>
           <w:bCs/>
-          <w:color w:val="000000" w:themeColor="text1"/>
+          <w:color w:val="EE0000"/>
           <w:sz w:val="24"/>
           <w:szCs w:val="24"/>
         </w:rPr>
@@ -10707,7 +10691,7 @@
           <w:rFonts w:ascii="Times New Roman" w:hAnsi="Times New Roman" w:cs="Times New Roman"/>
           <w:b/>
           <w:bCs/>
-          <w:color w:val="000000" w:themeColor="text1"/>
+          <w:color w:val="EE0000"/>
           <w:sz w:val="24"/>
           <w:szCs w:val="24"/>
         </w:rPr>
@@ -10718,7 +10702,7 @@
           <w:rFonts w:ascii="Times New Roman" w:hAnsi="Times New Roman" w:cs="Times New Roman"/>
           <w:b/>
           <w:bCs/>
-          <w:color w:val="000000" w:themeColor="text1"/>
+          <w:color w:val="EE0000"/>
           <w:sz w:val="24"/>
           <w:szCs w:val="24"/>
         </w:rPr>
@@ -10727,7 +10711,7 @@
       <w:r>
         <w:rPr>
           <w:rFonts w:ascii="Times New Roman" w:hAnsi="Times New Roman" w:cs="Times New Roman"/>
-          <w:color w:val="000000" w:themeColor="text1"/>
+          <w:color w:val="EE0000"/>
           <w:sz w:val="24"/>
           <w:szCs w:val="24"/>
         </w:rPr>
@@ -10810,7 +10794,7 @@
           <w:rFonts w:ascii="Times New Roman" w:hAnsi="Times New Roman" w:cs="Times New Roman"/>
           <w:b/>
           <w:bCs/>
-          <w:color w:val="000000" w:themeColor="text1"/>
+          <w:color w:val="EE0000"/>
           <w:sz w:val="24"/>
           <w:szCs w:val="24"/>
         </w:rPr>
@@ -10821,7 +10805,7 @@
           <w:rFonts w:ascii="Times New Roman" w:hAnsi="Times New Roman" w:cs="Times New Roman"/>
           <w:b/>
           <w:bCs/>
-          <w:color w:val="000000" w:themeColor="text1"/>
+          <w:color w:val="EE0000"/>
           <w:sz w:val="24"/>
           <w:szCs w:val="24"/>
         </w:rPr>
@@ -10856,7 +10840,7 @@
           <w:rFonts w:ascii="Times New Roman" w:hAnsi="Times New Roman" w:cs="Times New Roman"/>
           <w:b/>
           <w:bCs/>
-          <w:color w:val="000000" w:themeColor="text1"/>
+          <w:color w:val="EE0000"/>
           <w:sz w:val="24"/>
           <w:szCs w:val="24"/>
         </w:rPr>
@@ -10867,7 +10851,7 @@
           <w:rFonts w:ascii="Times New Roman" w:hAnsi="Times New Roman" w:cs="Times New Roman"/>
           <w:b/>
           <w:bCs/>
-          <w:color w:val="000000" w:themeColor="text1"/>
+          <w:color w:val="EE0000"/>
           <w:sz w:val="24"/>
           <w:szCs w:val="24"/>
         </w:rPr>
@@ -10878,7 +10862,7 @@
           <w:rFonts w:ascii="Times New Roman" w:hAnsi="Times New Roman" w:cs="Times New Roman"/>
           <w:b/>
           <w:bCs/>
-          <w:color w:val="000000" w:themeColor="text1"/>
+          <w:color w:val="EE0000"/>
           <w:sz w:val="24"/>
           <w:szCs w:val="24"/>
         </w:rPr>
@@ -10889,7 +10873,7 @@
           <w:rFonts w:ascii="Times New Roman" w:hAnsi="Times New Roman" w:cs="Times New Roman"/>
           <w:b/>
           <w:bCs/>
-          <w:color w:val="000000" w:themeColor="text1"/>
+          <w:color w:val="EE0000"/>
           <w:sz w:val="24"/>
           <w:szCs w:val="24"/>
         </w:rPr>
@@ -11664,7 +11648,7 @@
           <w:rFonts w:ascii="Times New Roman" w:hAnsi="Times New Roman" w:cs="Times New Roman"/>
           <w:b/>
           <w:bCs/>
-          <w:color w:val="000000" w:themeColor="text1"/>
+          <w:color w:val="EE0000"/>
           <w:sz w:val="24"/>
           <w:szCs w:val="24"/>
         </w:rPr>
@@ -11675,7 +11659,7 @@
           <w:rFonts w:ascii="Times New Roman" w:hAnsi="Times New Roman" w:cs="Times New Roman"/>
           <w:b/>
           <w:bCs/>
-          <w:color w:val="000000" w:themeColor="text1"/>
+          <w:color w:val="EE0000"/>
           <w:sz w:val="24"/>
           <w:szCs w:val="24"/>
         </w:rPr>
@@ -11686,7 +11670,7 @@
           <w:rFonts w:ascii="Times New Roman" w:hAnsi="Times New Roman" w:cs="Times New Roman"/>
           <w:b/>
           <w:bCs/>
-          <w:color w:val="000000" w:themeColor="text1"/>
+          <w:color w:val="EE0000"/>
           <w:sz w:val="24"/>
           <w:szCs w:val="24"/>
         </w:rPr>
@@ -11697,169 +11681,170 @@
           <w:rFonts w:ascii="Times New Roman" w:hAnsi="Times New Roman" w:cs="Times New Roman"/>
           <w:b/>
           <w:bCs/>
-          <w:color w:val="000000" w:themeColor="text1"/>
-          <w:sz w:val="24"/>
-          <w:szCs w:val="24"/>
-        </w:rPr>
-        <w:t>,</w:t>
+          <w:color w:val="EE0000"/>
+          <w:sz w:val="24"/>
+          <w:szCs w:val="24"/>
+        </w:rPr>
+        <w:t>,000</w:t>
+      </w:r>
+      <w:r>
+        <w:rPr>
+          <w:rFonts w:ascii="Times New Roman" w:hAnsi="Times New Roman" w:cs="Times New Roman"/>
+          <w:color w:val="EE0000"/>
+          <w:sz w:val="24"/>
+          <w:szCs w:val="24"/>
+        </w:rPr>
+        <w:t xml:space="preserve"> </w:t>
       </w:r>
       <w:r>
         <w:rPr>
           <w:rFonts w:ascii="Times New Roman" w:hAnsi="Times New Roman" w:cs="Times New Roman"/>
           <w:b/>
           <w:bCs/>
-          <w:color w:val="000000" w:themeColor="text1"/>
-          <w:sz w:val="24"/>
-          <w:szCs w:val="24"/>
-        </w:rPr>
-        <w:t>000</w:t>
-      </w:r>
-      <w:r>
-        <w:rPr>
-          <w:rFonts w:ascii="Times New Roman" w:hAnsi="Times New Roman" w:cs="Times New Roman"/>
-          <w:color w:val="000000" w:themeColor="text1"/>
-          <w:sz w:val="24"/>
-          <w:szCs w:val="24"/>
-        </w:rPr>
-        <w:t xml:space="preserve"> </w:t>
+          <w:color w:val="EE0000"/>
+          <w:sz w:val="24"/>
+          <w:szCs w:val="24"/>
+          <w:lang w:val="mn-MN"/>
+        </w:rPr>
+        <w:t>төгрөгийг</w:t>
       </w:r>
       <w:r>
         <w:rPr>
           <w:rFonts w:ascii="Times New Roman" w:hAnsi="Times New Roman" w:cs="Times New Roman"/>
           <w:b/>
           <w:bCs/>
-          <w:color w:val="000000" w:themeColor="text1"/>
-          <w:sz w:val="24"/>
-          <w:szCs w:val="24"/>
-          <w:lang w:val="mn-MN"/>
-        </w:rPr>
-        <w:t>төгрөгийг</w:t>
+          <w:color w:val="EE0000"/>
+          <w:sz w:val="24"/>
+          <w:szCs w:val="24"/>
+        </w:rPr>
+        <w:t xml:space="preserve"> 202</w:t>
       </w:r>
       <w:r>
         <w:rPr>
           <w:rFonts w:ascii="Times New Roman" w:hAnsi="Times New Roman" w:cs="Times New Roman"/>
           <w:b/>
           <w:bCs/>
-          <w:color w:val="000000" w:themeColor="text1"/>
-          <w:sz w:val="24"/>
-          <w:szCs w:val="24"/>
-        </w:rPr>
-        <w:t xml:space="preserve"> 202</w:t>
+          <w:color w:val="EE0000"/>
+          <w:sz w:val="24"/>
+          <w:szCs w:val="24"/>
+        </w:rPr>
+        <w:t>6</w:t>
       </w:r>
       <w:r>
         <w:rPr>
           <w:rFonts w:ascii="Times New Roman" w:hAnsi="Times New Roman" w:cs="Times New Roman"/>
           <w:b/>
           <w:bCs/>
-          <w:color w:val="000000" w:themeColor="text1"/>
-          <w:sz w:val="24"/>
-          <w:szCs w:val="24"/>
-        </w:rPr>
-        <w:t>6</w:t>
+          <w:color w:val="EE0000"/>
+          <w:sz w:val="24"/>
+          <w:szCs w:val="24"/>
+        </w:rPr>
+        <w:t xml:space="preserve"> </w:t>
       </w:r>
       <w:r>
         <w:rPr>
           <w:rFonts w:ascii="Times New Roman" w:hAnsi="Times New Roman" w:cs="Times New Roman"/>
           <w:b/>
           <w:bCs/>
-          <w:color w:val="000000" w:themeColor="text1"/>
-          <w:sz w:val="24"/>
-          <w:szCs w:val="24"/>
-        </w:rPr>
-        <w:t xml:space="preserve"> </w:t>
+          <w:color w:val="EE0000"/>
+          <w:sz w:val="24"/>
+          <w:szCs w:val="24"/>
+          <w:lang w:val="mn-MN"/>
+        </w:rPr>
+        <w:t xml:space="preserve">оны </w:t>
       </w:r>
       <w:r>
         <w:rPr>
           <w:rFonts w:ascii="Times New Roman" w:hAnsi="Times New Roman" w:cs="Times New Roman"/>
           <w:b/>
           <w:bCs/>
-          <w:color w:val="000000" w:themeColor="text1"/>
+          <w:color w:val="EE0000"/>
           <w:sz w:val="24"/>
           <w:szCs w:val="24"/>
           <w:lang w:val="mn-MN"/>
         </w:rPr>
-        <w:t xml:space="preserve">оны </w:t>
+        <w:t>01</w:t>
       </w:r>
       <w:r>
         <w:rPr>
           <w:rFonts w:ascii="Times New Roman" w:hAnsi="Times New Roman" w:cs="Times New Roman"/>
           <w:b/>
           <w:bCs/>
-          <w:color w:val="000000" w:themeColor="text1"/>
+          <w:color w:val="EE0000"/>
           <w:sz w:val="24"/>
           <w:szCs w:val="24"/>
           <w:lang w:val="mn-MN"/>
         </w:rPr>
-        <w:t>01</w:t>
-      </w:r>
+        <w:t xml:space="preserve">-р </w:t>
+      </w:r>
+      <w:proofErr w:type="spellStart"/>
       <w:r>
         <w:rPr>
           <w:rFonts w:ascii="Times New Roman" w:hAnsi="Times New Roman" w:cs="Times New Roman"/>
           <w:b/>
           <w:bCs/>
-          <w:color w:val="000000" w:themeColor="text1"/>
-          <w:sz w:val="24"/>
-          <w:szCs w:val="24"/>
-          <w:lang w:val="mn-MN"/>
-        </w:rPr>
-        <w:t xml:space="preserve">-р </w:t>
-      </w:r>
-      <w:proofErr w:type="spellStart"/>
+          <w:color w:val="EE0000"/>
+          <w:sz w:val="24"/>
+          <w:szCs w:val="24"/>
+        </w:rPr>
+        <w:t>сарын</w:t>
+      </w:r>
+      <w:proofErr w:type="spellEnd"/>
       <w:r>
         <w:rPr>
           <w:rFonts w:ascii="Times New Roman" w:hAnsi="Times New Roman" w:cs="Times New Roman"/>
           <w:b/>
           <w:bCs/>
-          <w:color w:val="000000" w:themeColor="text1"/>
-          <w:sz w:val="24"/>
-          <w:szCs w:val="24"/>
-        </w:rPr>
-        <w:t>сарын</w:t>
-      </w:r>
-      <w:proofErr w:type="spellEnd"/>
+          <w:color w:val="EE0000"/>
+          <w:sz w:val="24"/>
+          <w:szCs w:val="24"/>
+        </w:rPr>
+        <w:t xml:space="preserve"> </w:t>
+      </w:r>
       <w:r>
         <w:rPr>
           <w:rFonts w:ascii="Times New Roman" w:hAnsi="Times New Roman" w:cs="Times New Roman"/>
           <w:b/>
           <w:bCs/>
-          <w:color w:val="000000" w:themeColor="text1"/>
-          <w:sz w:val="24"/>
-          <w:szCs w:val="24"/>
-        </w:rPr>
-        <w:t xml:space="preserve"> </w:t>
+          <w:color w:val="EE0000"/>
+          <w:sz w:val="24"/>
+          <w:szCs w:val="24"/>
+        </w:rPr>
+        <w:t>2</w:t>
       </w:r>
       <w:r>
         <w:rPr>
           <w:rFonts w:ascii="Times New Roman" w:hAnsi="Times New Roman" w:cs="Times New Roman"/>
           <w:b/>
           <w:bCs/>
-          <w:color w:val="000000" w:themeColor="text1"/>
-          <w:sz w:val="24"/>
-          <w:szCs w:val="24"/>
-        </w:rPr>
-        <w:t>2</w:t>
+          <w:color w:val="EE0000"/>
+          <w:sz w:val="24"/>
+          <w:szCs w:val="24"/>
+        </w:rPr>
+        <w:t>6</w:t>
       </w:r>
       <w:r>
         <w:rPr>
           <w:rFonts w:ascii="Times New Roman" w:hAnsi="Times New Roman" w:cs="Times New Roman"/>
           <w:b/>
           <w:bCs/>
-          <w:color w:val="000000" w:themeColor="text1"/>
-          <w:sz w:val="24"/>
-          <w:szCs w:val="24"/>
-        </w:rPr>
-        <w:t>6</w:t>
+          <w:color w:val="EE0000"/>
+          <w:sz w:val="24"/>
+          <w:szCs w:val="24"/>
+        </w:rPr>
+        <w:t xml:space="preserve"> </w:t>
       </w:r>
       <w:r>
         <w:rPr>
           <w:rFonts w:ascii="Times New Roman" w:hAnsi="Times New Roman" w:cs="Times New Roman"/>
           <w:b/>
           <w:bCs/>
-          <w:color w:val="000000" w:themeColor="text1"/>
-          <w:sz w:val="24"/>
-          <w:szCs w:val="24"/>
-        </w:rPr>
-        <w:t xml:space="preserve"> </w:t>
+          <w:color w:val="EE0000"/>
+          <w:sz w:val="24"/>
+          <w:szCs w:val="24"/>
+          <w:lang w:val="mn-MN"/>
+        </w:rPr>
+        <w:t>өдөр</w:t>
       </w:r>
       <w:r>
         <w:rPr>
@@ -11871,7 +11856,7 @@
           <w:szCs w:val="24"/>
           <w:lang w:val="mn-MN"/>
         </w:rPr>
-        <w:t xml:space="preserve">өдөр </w:t>
+        <w:t xml:space="preserve"> </w:t>
       </w:r>
       <w:r>
         <w:rPr>
@@ -12077,7 +12062,7 @@
           <w:rFonts w:ascii="Times New Roman" w:hAnsi="Times New Roman" w:cs="Times New Roman"/>
           <w:b/>
           <w:bCs/>
-          <w:color w:val="000000" w:themeColor="text1"/>
+          <w:color w:val="EE0000"/>
           <w:sz w:val="24"/>
           <w:szCs w:val="24"/>
           <w:lang w:val="mn-MN"/>
@@ -12089,7 +12074,7 @@
           <w:rFonts w:ascii="Times New Roman" w:hAnsi="Times New Roman" w:cs="Times New Roman"/>
           <w:b/>
           <w:bCs/>
-          <w:color w:val="000000" w:themeColor="text1"/>
+          <w:color w:val="EE0000"/>
           <w:sz w:val="24"/>
           <w:szCs w:val="24"/>
           <w:lang w:val="mn-MN"/>
@@ -12101,7 +12086,7 @@
           <w:rFonts w:ascii="Times New Roman" w:hAnsi="Times New Roman" w:cs="Times New Roman"/>
           <w:b/>
           <w:bCs/>
-          <w:color w:val="000000" w:themeColor="text1"/>
+          <w:color w:val="EE0000"/>
           <w:sz w:val="24"/>
           <w:szCs w:val="24"/>
           <w:lang w:val="mn-MN"/>
@@ -12113,7 +12098,7 @@
           <w:rFonts w:ascii="Times New Roman" w:hAnsi="Times New Roman" w:cs="Times New Roman"/>
           <w:b/>
           <w:bCs/>
-          <w:color w:val="000000" w:themeColor="text1"/>
+          <w:color w:val="EE0000"/>
           <w:sz w:val="24"/>
           <w:szCs w:val="24"/>
           <w:lang w:val="mn-MN"/>
@@ -12125,7 +12110,7 @@
           <w:rFonts w:ascii="Times New Roman" w:hAnsi="Times New Roman" w:cs="Times New Roman"/>
           <w:b/>
           <w:bCs/>
-          <w:color w:val="000000" w:themeColor="text1"/>
+          <w:color w:val="EE0000"/>
           <w:sz w:val="24"/>
           <w:szCs w:val="24"/>
           <w:lang w:val="mn-MN"/>
@@ -12137,7 +12122,7 @@
           <w:rFonts w:ascii="Times New Roman" w:hAnsi="Times New Roman" w:cs="Times New Roman"/>
           <w:b/>
           <w:bCs/>
-          <w:color w:val="000000" w:themeColor="text1"/>
+          <w:color w:val="EE0000"/>
           <w:sz w:val="24"/>
           <w:szCs w:val="24"/>
           <w:lang w:val="mn-MN"/>
@@ -12149,7 +12134,7 @@
           <w:rFonts w:ascii="Times New Roman" w:hAnsi="Times New Roman" w:cs="Times New Roman"/>
           <w:b/>
           <w:bCs/>
-          <w:color w:val="000000" w:themeColor="text1"/>
+          <w:color w:val="EE0000"/>
           <w:sz w:val="24"/>
           <w:szCs w:val="24"/>
           <w:lang w:val="mn-MN"/>
@@ -12161,7 +12146,7 @@
           <w:rFonts w:ascii="Times New Roman" w:hAnsi="Times New Roman" w:cs="Times New Roman"/>
           <w:b/>
           <w:bCs/>
-          <w:color w:val="000000" w:themeColor="text1"/>
+          <w:color w:val="EE0000"/>
           <w:sz w:val="24"/>
           <w:szCs w:val="24"/>
           <w:lang w:val="mn-MN"/>
@@ -12173,7 +12158,7 @@
           <w:rFonts w:ascii="Times New Roman" w:hAnsi="Times New Roman" w:cs="Times New Roman"/>
           <w:b/>
           <w:bCs/>
-          <w:color w:val="000000" w:themeColor="text1"/>
+          <w:color w:val="EE0000"/>
           <w:sz w:val="24"/>
           <w:szCs w:val="24"/>
           <w:lang w:val="mn-MN"/>
@@ -12185,7 +12170,7 @@
           <w:rFonts w:ascii="Times New Roman" w:hAnsi="Times New Roman" w:cs="Times New Roman"/>
           <w:b/>
           <w:bCs/>
-          <w:color w:val="000000" w:themeColor="text1"/>
+          <w:color w:val="EE0000"/>
           <w:sz w:val="24"/>
           <w:szCs w:val="24"/>
           <w:lang w:val="mn-MN"/>
@@ -13144,7 +13129,6 @@
           <w:color w:val="000000" w:themeColor="text1"/>
           <w:sz w:val="24"/>
           <w:szCs w:val="24"/>
-          <w:highlight w:val="yellow"/>
         </w:rPr>
         <w:t>Аялал</w:t>
       </w:r>
@@ -13155,18 +13139,16 @@
           <w:color w:val="000000" w:themeColor="text1"/>
           <w:sz w:val="24"/>
           <w:szCs w:val="24"/>
-          <w:highlight w:val="yellow"/>
-        </w:rPr>
-        <w:t xml:space="preserve"> </w:t>
-      </w:r>
-      <w:proofErr w:type="spellStart"/>
-      <w:r>
-        <w:rPr>
-          <w:rFonts w:ascii="Times New Roman" w:hAnsi="Times New Roman" w:cs="Times New Roman"/>
-          <w:color w:val="000000" w:themeColor="text1"/>
-          <w:sz w:val="24"/>
-          <w:szCs w:val="24"/>
-          <w:highlight w:val="yellow"/>
+        </w:rPr>
+        <w:t xml:space="preserve"> </w:t>
+      </w:r>
+      <w:proofErr w:type="spellStart"/>
+      <w:r>
+        <w:rPr>
+          <w:rFonts w:ascii="Times New Roman" w:hAnsi="Times New Roman" w:cs="Times New Roman"/>
+          <w:color w:val="000000" w:themeColor="text1"/>
+          <w:sz w:val="24"/>
+          <w:szCs w:val="24"/>
         </w:rPr>
         <w:t>эхлэхээс</w:t>
       </w:r>
@@ -13177,7 +13159,6 @@
           <w:color w:val="000000" w:themeColor="text1"/>
           <w:sz w:val="24"/>
           <w:szCs w:val="24"/>
-          <w:highlight w:val="yellow"/>
         </w:rPr>
         <w:t xml:space="preserve"> 30 </w:t>
       </w:r>
@@ -13188,7 +13169,6 @@
           <w:color w:val="000000" w:themeColor="text1"/>
           <w:sz w:val="24"/>
           <w:szCs w:val="24"/>
-          <w:highlight w:val="yellow"/>
         </w:rPr>
         <w:t>хоногийн</w:t>
       </w:r>
@@ -13199,18 +13179,16 @@
           <w:color w:val="000000" w:themeColor="text1"/>
           <w:sz w:val="24"/>
           <w:szCs w:val="24"/>
-          <w:highlight w:val="yellow"/>
-        </w:rPr>
-        <w:t xml:space="preserve"> </w:t>
-      </w:r>
-      <w:proofErr w:type="spellStart"/>
-      <w:r>
-        <w:rPr>
-          <w:rFonts w:ascii="Times New Roman" w:hAnsi="Times New Roman" w:cs="Times New Roman"/>
-          <w:color w:val="000000" w:themeColor="text1"/>
-          <w:sz w:val="24"/>
-          <w:szCs w:val="24"/>
-          <w:highlight w:val="yellow"/>
+        </w:rPr>
+        <w:t xml:space="preserve"> </w:t>
+      </w:r>
+      <w:proofErr w:type="spellStart"/>
+      <w:r>
+        <w:rPr>
+          <w:rFonts w:ascii="Times New Roman" w:hAnsi="Times New Roman" w:cs="Times New Roman"/>
+          <w:color w:val="000000" w:themeColor="text1"/>
+          <w:sz w:val="24"/>
+          <w:szCs w:val="24"/>
         </w:rPr>
         <w:t>өмнө</w:t>
       </w:r>
@@ -13221,18 +13199,16 @@
           <w:color w:val="000000" w:themeColor="text1"/>
           <w:sz w:val="24"/>
           <w:szCs w:val="24"/>
-          <w:highlight w:val="yellow"/>
-        </w:rPr>
-        <w:t xml:space="preserve"> </w:t>
-      </w:r>
-      <w:proofErr w:type="spellStart"/>
-      <w:r>
-        <w:rPr>
-          <w:rFonts w:ascii="Times New Roman" w:hAnsi="Times New Roman" w:cs="Times New Roman"/>
-          <w:color w:val="000000" w:themeColor="text1"/>
-          <w:sz w:val="24"/>
-          <w:szCs w:val="24"/>
-          <w:highlight w:val="yellow"/>
+        </w:rPr>
+        <w:t xml:space="preserve"> </w:t>
+      </w:r>
+      <w:proofErr w:type="spellStart"/>
+      <w:r>
+        <w:rPr>
+          <w:rFonts w:ascii="Times New Roman" w:hAnsi="Times New Roman" w:cs="Times New Roman"/>
+          <w:color w:val="000000" w:themeColor="text1"/>
+          <w:sz w:val="24"/>
+          <w:szCs w:val="24"/>
         </w:rPr>
         <w:t>захиалгыг</w:t>
       </w:r>
@@ -13243,60 +13219,36 @@
           <w:color w:val="000000" w:themeColor="text1"/>
           <w:sz w:val="24"/>
           <w:szCs w:val="24"/>
-          <w:highlight w:val="yellow"/>
-        </w:rPr>
-        <w:t xml:space="preserve"> </w:t>
-      </w:r>
-      <w:proofErr w:type="spellStart"/>
-      <w:r>
-        <w:rPr>
-          <w:rFonts w:ascii="Times New Roman" w:hAnsi="Times New Roman" w:cs="Times New Roman"/>
-          <w:color w:val="000000" w:themeColor="text1"/>
-          <w:sz w:val="24"/>
-          <w:szCs w:val="24"/>
-          <w:highlight w:val="yellow"/>
-        </w:rPr>
-        <w:t>цуц</w:t>
-      </w:r>
-      <w:r>
-        <w:rPr>
-          <w:rFonts w:ascii="Times New Roman" w:hAnsi="Times New Roman" w:cs="Times New Roman"/>
-          <w:color w:val="000000" w:themeColor="text1"/>
-          <w:sz w:val="24"/>
-          <w:szCs w:val="24"/>
-          <w:highlight w:val="yellow"/>
-        </w:rPr>
-        <w:t>ал</w:t>
-      </w:r>
-      <w:r>
-        <w:rPr>
-          <w:rFonts w:ascii="Times New Roman" w:hAnsi="Times New Roman" w:cs="Times New Roman"/>
-          <w:color w:val="000000" w:themeColor="text1"/>
-          <w:sz w:val="24"/>
-          <w:szCs w:val="24"/>
-          <w:highlight w:val="yellow"/>
-        </w:rPr>
-        <w:t>сан</w:t>
-      </w:r>
-      <w:proofErr w:type="spellEnd"/>
-      <w:r>
-        <w:rPr>
-          <w:rFonts w:ascii="Times New Roman" w:hAnsi="Times New Roman" w:cs="Times New Roman"/>
-          <w:color w:val="000000" w:themeColor="text1"/>
-          <w:sz w:val="24"/>
-          <w:szCs w:val="24"/>
-          <w:highlight w:val="yellow"/>
-        </w:rPr>
-        <w:t xml:space="preserve"> </w:t>
-      </w:r>
-      <w:proofErr w:type="spellStart"/>
-      <w:r>
-        <w:rPr>
-          <w:rFonts w:ascii="Times New Roman" w:hAnsi="Times New Roman" w:cs="Times New Roman"/>
-          <w:color w:val="000000" w:themeColor="text1"/>
-          <w:sz w:val="24"/>
-          <w:szCs w:val="24"/>
-          <w:highlight w:val="yellow"/>
+        </w:rPr>
+        <w:t xml:space="preserve"> </w:t>
+      </w:r>
+      <w:proofErr w:type="spellStart"/>
+      <w:r>
+        <w:rPr>
+          <w:rFonts w:ascii="Times New Roman" w:hAnsi="Times New Roman" w:cs="Times New Roman"/>
+          <w:color w:val="000000" w:themeColor="text1"/>
+          <w:sz w:val="24"/>
+          <w:szCs w:val="24"/>
+        </w:rPr>
+        <w:t>цуцалсан</w:t>
+      </w:r>
+      <w:proofErr w:type="spellEnd"/>
+      <w:r>
+        <w:rPr>
+          <w:rFonts w:ascii="Times New Roman" w:hAnsi="Times New Roman" w:cs="Times New Roman"/>
+          <w:color w:val="000000" w:themeColor="text1"/>
+          <w:sz w:val="24"/>
+          <w:szCs w:val="24"/>
+        </w:rPr>
+        <w:t xml:space="preserve"> </w:t>
+      </w:r>
+      <w:proofErr w:type="spellStart"/>
+      <w:r>
+        <w:rPr>
+          <w:rFonts w:ascii="Times New Roman" w:hAnsi="Times New Roman" w:cs="Times New Roman"/>
+          <w:color w:val="000000" w:themeColor="text1"/>
+          <w:sz w:val="24"/>
+          <w:szCs w:val="24"/>
         </w:rPr>
         <w:t>тохиолдолд</w:t>
       </w:r>
@@ -13307,18 +13259,16 @@
           <w:color w:val="000000" w:themeColor="text1"/>
           <w:sz w:val="24"/>
           <w:szCs w:val="24"/>
-          <w:highlight w:val="yellow"/>
-        </w:rPr>
-        <w:t xml:space="preserve"> </w:t>
-      </w:r>
-      <w:proofErr w:type="spellStart"/>
-      <w:r>
-        <w:rPr>
-          <w:rFonts w:ascii="Times New Roman" w:hAnsi="Times New Roman" w:cs="Times New Roman"/>
-          <w:color w:val="000000" w:themeColor="text1"/>
-          <w:sz w:val="24"/>
-          <w:szCs w:val="24"/>
-          <w:highlight w:val="yellow"/>
+        </w:rPr>
+        <w:t xml:space="preserve"> </w:t>
+      </w:r>
+      <w:proofErr w:type="spellStart"/>
+      <w:r>
+        <w:rPr>
+          <w:rFonts w:ascii="Times New Roman" w:hAnsi="Times New Roman" w:cs="Times New Roman"/>
+          <w:color w:val="000000" w:themeColor="text1"/>
+          <w:sz w:val="24"/>
+          <w:szCs w:val="24"/>
         </w:rPr>
         <w:t>нийт</w:t>
       </w:r>
@@ -13329,18 +13279,16 @@
           <w:color w:val="000000" w:themeColor="text1"/>
           <w:sz w:val="24"/>
           <w:szCs w:val="24"/>
-          <w:highlight w:val="yellow"/>
-        </w:rPr>
-        <w:t xml:space="preserve"> </w:t>
-      </w:r>
-      <w:proofErr w:type="spellStart"/>
-      <w:r>
-        <w:rPr>
-          <w:rFonts w:ascii="Times New Roman" w:hAnsi="Times New Roman" w:cs="Times New Roman"/>
-          <w:color w:val="000000" w:themeColor="text1"/>
-          <w:sz w:val="24"/>
-          <w:szCs w:val="24"/>
-          <w:highlight w:val="yellow"/>
+        </w:rPr>
+        <w:t xml:space="preserve"> </w:t>
+      </w:r>
+      <w:proofErr w:type="spellStart"/>
+      <w:r>
+        <w:rPr>
+          <w:rFonts w:ascii="Times New Roman" w:hAnsi="Times New Roman" w:cs="Times New Roman"/>
+          <w:color w:val="000000" w:themeColor="text1"/>
+          <w:sz w:val="24"/>
+          <w:szCs w:val="24"/>
         </w:rPr>
         <w:t>аяллын</w:t>
       </w:r>
@@ -13351,18 +13299,16 @@
           <w:color w:val="000000" w:themeColor="text1"/>
           <w:sz w:val="24"/>
           <w:szCs w:val="24"/>
-          <w:highlight w:val="yellow"/>
-        </w:rPr>
-        <w:t xml:space="preserve"> </w:t>
-      </w:r>
-      <w:proofErr w:type="spellStart"/>
-      <w:r>
-        <w:rPr>
-          <w:rFonts w:ascii="Times New Roman" w:hAnsi="Times New Roman" w:cs="Times New Roman"/>
-          <w:color w:val="000000" w:themeColor="text1"/>
-          <w:sz w:val="24"/>
-          <w:szCs w:val="24"/>
-          <w:highlight w:val="yellow"/>
+        </w:rPr>
+        <w:t xml:space="preserve"> </w:t>
+      </w:r>
+      <w:proofErr w:type="spellStart"/>
+      <w:r>
+        <w:rPr>
+          <w:rFonts w:ascii="Times New Roman" w:hAnsi="Times New Roman" w:cs="Times New Roman"/>
+          <w:color w:val="000000" w:themeColor="text1"/>
+          <w:sz w:val="24"/>
+          <w:szCs w:val="24"/>
         </w:rPr>
         <w:t>дүнгийн</w:t>
       </w:r>
@@ -13373,38 +13319,16 @@
           <w:color w:val="000000" w:themeColor="text1"/>
           <w:sz w:val="24"/>
           <w:szCs w:val="24"/>
-          <w:highlight w:val="yellow"/>
-        </w:rPr>
-        <w:t xml:space="preserve"> </w:t>
-      </w:r>
-      <w:r>
-        <w:rPr>
-          <w:rFonts w:ascii="Times New Roman" w:hAnsi="Times New Roman" w:cs="Times New Roman"/>
-          <w:color w:val="000000" w:themeColor="text1"/>
-          <w:sz w:val="24"/>
-          <w:szCs w:val="24"/>
-          <w:highlight w:val="yellow"/>
-        </w:rPr>
-        <w:t>7</w:t>
-      </w:r>
-      <w:r>
-        <w:rPr>
-          <w:rFonts w:ascii="Times New Roman" w:hAnsi="Times New Roman" w:cs="Times New Roman"/>
-          <w:color w:val="000000" w:themeColor="text1"/>
-          <w:sz w:val="24"/>
-          <w:szCs w:val="24"/>
-          <w:highlight w:val="yellow"/>
-        </w:rPr>
-        <w:t>0%-</w:t>
-      </w:r>
-      <w:proofErr w:type="spellStart"/>
-      <w:r>
-        <w:rPr>
-          <w:rFonts w:ascii="Times New Roman" w:hAnsi="Times New Roman" w:cs="Times New Roman"/>
-          <w:color w:val="000000" w:themeColor="text1"/>
-          <w:sz w:val="24"/>
-          <w:szCs w:val="24"/>
-          <w:highlight w:val="yellow"/>
+        </w:rPr>
+        <w:t xml:space="preserve"> 70%-</w:t>
+      </w:r>
+      <w:proofErr w:type="spellStart"/>
+      <w:r>
+        <w:rPr>
+          <w:rFonts w:ascii="Times New Roman" w:hAnsi="Times New Roman" w:cs="Times New Roman"/>
+          <w:color w:val="000000" w:themeColor="text1"/>
+          <w:sz w:val="24"/>
+          <w:szCs w:val="24"/>
         </w:rPr>
         <w:t>ийг</w:t>
       </w:r>
@@ -13415,18 +13339,16 @@
           <w:color w:val="000000" w:themeColor="text1"/>
           <w:sz w:val="24"/>
           <w:szCs w:val="24"/>
-          <w:highlight w:val="yellow"/>
-        </w:rPr>
-        <w:t xml:space="preserve"> </w:t>
-      </w:r>
-      <w:proofErr w:type="spellStart"/>
-      <w:r>
-        <w:rPr>
-          <w:rFonts w:ascii="Times New Roman" w:hAnsi="Times New Roman" w:cs="Times New Roman"/>
-          <w:color w:val="000000" w:themeColor="text1"/>
-          <w:sz w:val="24"/>
-          <w:szCs w:val="24"/>
-          <w:highlight w:val="yellow"/>
+        </w:rPr>
+        <w:t xml:space="preserve"> </w:t>
+      </w:r>
+      <w:proofErr w:type="spellStart"/>
+      <w:r>
+        <w:rPr>
+          <w:rFonts w:ascii="Times New Roman" w:hAnsi="Times New Roman" w:cs="Times New Roman"/>
+          <w:color w:val="000000" w:themeColor="text1"/>
+          <w:sz w:val="24"/>
+          <w:szCs w:val="24"/>
         </w:rPr>
         <w:t>суутгана</w:t>
       </w:r>
@@ -13448,16 +13370,7 @@
           <w:sz w:val="24"/>
           <w:szCs w:val="24"/>
         </w:rPr>
-        <w:t>Буса</w:t>
-      </w:r>
-      <w:r>
-        <w:rPr>
-          <w:rFonts w:ascii="Times New Roman" w:hAnsi="Times New Roman" w:cs="Times New Roman"/>
-          <w:color w:val="000000" w:themeColor="text1"/>
-          <w:sz w:val="24"/>
-          <w:szCs w:val="24"/>
-        </w:rPr>
-        <w:t>д</w:t>
+        <w:t>Бусад</w:t>
       </w:r>
       <w:proofErr w:type="spellEnd"/>
       <w:r>
@@ -21263,7 +21176,7 @@
               <w:jc w:val="both"/>
               <w:rPr>
                 <w:rFonts w:ascii="Times New Roman" w:eastAsia="Arial" w:hAnsi="Times New Roman" w:cs="Times New Roman"/>
-                <w:color w:val="000000" w:themeColor="text1"/>
+                <w:color w:val="EE0000"/>
                 <w:sz w:val="24"/>
                 <w:szCs w:val="24"/>
               </w:rPr>
@@ -21271,7 +21184,7 @@
             <w:r>
               <w:rPr>
                 <w:rFonts w:ascii="Times New Roman" w:eastAsia="Arial" w:hAnsi="Times New Roman" w:cs="Times New Roman"/>
-                <w:color w:val="000000" w:themeColor="text1"/>
+                <w:color w:val="EE0000"/>
                 <w:sz w:val="24"/>
                 <w:szCs w:val="24"/>
                 <w:lang w:val="mn-MN"/>
@@ -21281,7 +21194,7 @@
             <w:r>
               <w:rPr>
                 <w:rFonts w:ascii="Times New Roman" w:eastAsia="Arial" w:hAnsi="Times New Roman" w:cs="Times New Roman"/>
-                <w:color w:val="000000" w:themeColor="text1"/>
+                <w:color w:val="EE0000"/>
                 <w:sz w:val="24"/>
                 <w:szCs w:val="24"/>
                 <w:lang w:val="mn-MN"/>
@@ -21291,7 +21204,7 @@
             <w:r>
               <w:rPr>
                 <w:rFonts w:ascii="Times New Roman" w:eastAsia="Arial" w:hAnsi="Times New Roman" w:cs="Times New Roman"/>
-                <w:color w:val="000000" w:themeColor="text1"/>
+                <w:color w:val="EE0000"/>
                 <w:sz w:val="24"/>
                 <w:szCs w:val="24"/>
                 <w:lang w:val="mn-MN"/>

</xml_diff>